<commit_message>
docs: update project report
</commit_message>
<xml_diff>
--- a/docs/BaoCao.docx
+++ b/docs/BaoCao.docx
@@ -204,7 +204,7 @@
                     <pic:cNvPicPr/>
                   </pic:nvPicPr>
                   <pic:blipFill>
-                    <a:blip r:embed="rId10">
+                    <a:blip r:embed="rId12">
                       <a:extLst>
                         <a:ext uri="{28A0092B-C50C-407E-A947-70E740481C1C}">
                           <a14:useLocalDpi xmlns:a14="http://schemas.microsoft.com/office/drawing/2010/main" val="0"/>
@@ -896,8 +896,10 @@
         </w:rPr>
         <w:sectPr>
           <w:headerReference r:id="rId4" w:type="first"/>
+          <w:footerReference r:id="rId7" w:type="first"/>
           <w:headerReference r:id="rId3" w:type="default"/>
-          <w:footerReference r:id="rId5" w:type="even"/>
+          <w:footerReference r:id="rId5" w:type="default"/>
+          <w:footerReference r:id="rId6" w:type="even"/>
           <w:pgSz w:w="11901" w:h="16840"/>
           <w:pgMar w:top="1134" w:right="1134" w:bottom="1134" w:left="1701" w:header="709" w:footer="709" w:gutter="0"/>
           <w:cols w:space="708" w:num="1"/>
@@ -1986,8 +1988,8 @@
       <w:pPr>
         <w:spacing w:line="360" w:lineRule="auto"/>
         <w:sectPr>
-          <w:headerReference r:id="rId6" w:type="default"/>
-          <w:footerReference r:id="rId7" w:type="default"/>
+          <w:headerReference r:id="rId8" w:type="default"/>
+          <w:footerReference r:id="rId9" w:type="default"/>
           <w:pgSz w:w="11901" w:h="16840"/>
           <w:pgMar w:top="1134" w:right="1134" w:bottom="1134" w:left="1701" w:header="709" w:footer="709" w:gutter="0"/>
           <w:cols w:space="708" w:num="1"/>
@@ -3670,7 +3672,7 @@
         </w:tabs>
         <w:spacing w:line="360" w:lineRule="auto"/>
         <w:sectPr>
-          <w:footerReference r:id="rId8" w:type="default"/>
+          <w:footerReference r:id="rId10" w:type="default"/>
           <w:pgSz w:w="11901" w:h="16840"/>
           <w:pgMar w:top="1134" w:right="1134" w:bottom="1134" w:left="1701" w:header="709" w:footer="709" w:gutter="0"/>
           <w:pgNumType w:start="1"/>
@@ -5270,8 +5272,6 @@
         </w:rPr>
         <w:fldChar w:fldCharType="end"/>
       </w:r>
-      <w:bookmarkStart w:id="59" w:name="_GoBack"/>
-      <w:bookmarkEnd w:id="59"/>
     </w:p>
     <w:p>
       <w:pPr>
@@ -5512,8 +5512,8 @@
         </w:rPr>
         <w:t xml:space="preserve"> </w:t>
       </w:r>
-      <w:bookmarkStart w:id="2" w:name="_Toc241234518"/>
-      <w:bookmarkStart w:id="3" w:name="_Toc32025"/>
+      <w:bookmarkStart w:id="2" w:name="_Toc32025"/>
+      <w:bookmarkStart w:id="3" w:name="_Toc241234518"/>
       <w:r>
         <w:rPr>
           <w:rStyle w:val="20"/>
@@ -5588,8 +5588,8 @@
           <w:lang w:val="vi-VN" w:eastAsia="vi-VN"/>
         </w:rPr>
       </w:pPr>
-      <w:bookmarkStart w:id="4" w:name="_Toc241234519"/>
-      <w:bookmarkStart w:id="5" w:name="_Toc28772"/>
+      <w:bookmarkStart w:id="4" w:name="_Toc28772"/>
+      <w:bookmarkStart w:id="5" w:name="_Toc241234519"/>
       <w:r>
         <w:rPr>
           <w:rStyle w:val="20"/>
@@ -5845,8 +5845,8 @@
         <w:ind w:left="284" w:hanging="284"/>
         <w:jc w:val="both"/>
       </w:pPr>
-      <w:bookmarkStart w:id="6" w:name="_Toc241234520"/>
-      <w:bookmarkStart w:id="7" w:name="_Toc26111"/>
+      <w:bookmarkStart w:id="6" w:name="_Toc26111"/>
+      <w:bookmarkStart w:id="7" w:name="_Toc241234520"/>
       <w:r>
         <w:rPr>
           <w:rStyle w:val="20"/>
@@ -6044,8 +6044,8 @@
         <w:ind w:left="0" w:firstLine="0"/>
         <w:jc w:val="both"/>
       </w:pPr>
-      <w:bookmarkStart w:id="10" w:name="_Toc241234522"/>
-      <w:bookmarkStart w:id="11" w:name="_Toc9328"/>
+      <w:bookmarkStart w:id="10" w:name="_Toc9328"/>
+      <w:bookmarkStart w:id="11" w:name="_Toc241234522"/>
       <w:r>
         <w:rPr>
           <w:rStyle w:val="20"/>
@@ -6379,8 +6379,8 @@
         <w:spacing w:line="360" w:lineRule="auto"/>
         <w:ind w:left="716" w:leftChars="0" w:firstLineChars="0"/>
       </w:pPr>
-      <w:bookmarkStart w:id="12" w:name="_Toc241234523"/>
-      <w:bookmarkStart w:id="13" w:name="_Toc11331"/>
+      <w:bookmarkStart w:id="12" w:name="_Toc11331"/>
+      <w:bookmarkStart w:id="13" w:name="_Toc241234523"/>
       <w:r>
         <w:rPr>
           <w:rStyle w:val="20"/>
@@ -6618,8 +6618,8 @@
         <w:ind w:left="567"/>
         <w:jc w:val="both"/>
       </w:pPr>
-      <w:bookmarkStart w:id="16" w:name="_Toc241234525"/>
-      <w:bookmarkStart w:id="17" w:name="_Toc5057"/>
+      <w:bookmarkStart w:id="16" w:name="_Toc5057"/>
+      <w:bookmarkStart w:id="17" w:name="_Toc241234525"/>
       <w:r>
         <w:rPr>
           <w:rStyle w:val="20"/>
@@ -6693,7 +6693,7 @@
                     </pic:cNvPicPr>
                   </pic:nvPicPr>
                   <pic:blipFill>
-                    <a:blip r:embed="rId11"/>
+                    <a:blip r:embed="rId13"/>
                     <a:stretch>
                       <a:fillRect/>
                     </a:stretch>
@@ -6875,7 +6875,7 @@
                     </pic:cNvPicPr>
                   </pic:nvPicPr>
                   <pic:blipFill>
-                    <a:blip r:embed="rId12"/>
+                    <a:blip r:embed="rId14"/>
                     <a:srcRect t="1730"/>
                     <a:stretch>
                       <a:fillRect/>
@@ -6940,6 +6940,7 @@
       <w:pPr>
         <w:pStyle w:val="19"/>
         <w:numPr>
+          <w:ilvl w:val="0"/>
           <w:numId w:val="0"/>
         </w:numPr>
         <w:bidi w:val="0"/>
@@ -6961,6 +6962,7 @@
       <w:pPr>
         <w:pStyle w:val="19"/>
         <w:numPr>
+          <w:ilvl w:val="0"/>
           <w:numId w:val="0"/>
         </w:numPr>
         <w:bidi w:val="0"/>
@@ -6982,6 +6984,7 @@
       <w:pPr>
         <w:pStyle w:val="19"/>
         <w:numPr>
+          <w:ilvl w:val="0"/>
           <w:numId w:val="0"/>
         </w:numPr>
         <w:bidi w:val="0"/>
@@ -7003,6 +7006,7 @@
       <w:pPr>
         <w:pStyle w:val="19"/>
         <w:numPr>
+          <w:ilvl w:val="0"/>
           <w:numId w:val="0"/>
         </w:numPr>
         <w:bidi w:val="0"/>
@@ -7024,6 +7028,7 @@
       <w:pPr>
         <w:pStyle w:val="19"/>
         <w:numPr>
+          <w:ilvl w:val="0"/>
           <w:numId w:val="0"/>
         </w:numPr>
         <w:bidi w:val="0"/>
@@ -7045,6 +7050,7 @@
       <w:pPr>
         <w:pStyle w:val="19"/>
         <w:numPr>
+          <w:ilvl w:val="0"/>
           <w:numId w:val="0"/>
         </w:numPr>
         <w:bidi w:val="0"/>
@@ -7066,6 +7072,7 @@
       <w:pPr>
         <w:pStyle w:val="19"/>
         <w:numPr>
+          <w:ilvl w:val="0"/>
           <w:numId w:val="0"/>
         </w:numPr>
         <w:bidi w:val="0"/>
@@ -7279,7 +7286,7 @@
                     </pic:cNvPicPr>
                   </pic:nvPicPr>
                   <pic:blipFill>
-                    <a:blip r:embed="rId13"/>
+                    <a:blip r:embed="rId15"/>
                     <a:stretch>
                       <a:fillRect/>
                     </a:stretch>
@@ -7521,7 +7528,7 @@
                     </pic:cNvPicPr>
                   </pic:nvPicPr>
                   <pic:blipFill>
-                    <a:blip r:embed="rId14"/>
+                    <a:blip r:embed="rId16"/>
                     <a:stretch>
                       <a:fillRect/>
                     </a:stretch>
@@ -7624,7 +7631,7 @@
                     </pic:cNvPicPr>
                   </pic:nvPicPr>
                   <pic:blipFill>
-                    <a:blip r:embed="rId15"/>
+                    <a:blip r:embed="rId17"/>
                     <a:stretch>
                       <a:fillRect/>
                     </a:stretch>
@@ -7883,8 +7890,8 @@
         <w:spacing w:line="360" w:lineRule="auto"/>
         <w:ind w:left="432" w:leftChars="0" w:firstLineChars="0"/>
       </w:pPr>
-      <w:bookmarkStart w:id="39" w:name="_Toc241234531"/>
-      <w:bookmarkStart w:id="40" w:name="_Toc20286"/>
+      <w:bookmarkStart w:id="39" w:name="_Toc20286"/>
+      <w:bookmarkStart w:id="40" w:name="_Toc241234531"/>
       <w:r>
         <w:rPr>
           <w:rStyle w:val="20"/>
@@ -7900,8 +7907,8 @@
         <w:spacing w:line="360" w:lineRule="auto"/>
         <w:ind w:left="284"/>
       </w:pPr>
-      <w:bookmarkStart w:id="41" w:name="_Toc241234532"/>
-      <w:bookmarkStart w:id="42" w:name="_Toc12270"/>
+      <w:bookmarkStart w:id="41" w:name="_Toc12270"/>
+      <w:bookmarkStart w:id="42" w:name="_Toc241234532"/>
       <w:r>
         <w:rPr>
           <w:rStyle w:val="20"/>
@@ -9614,8 +9621,8 @@
           <w:lang w:val="vi-VN"/>
         </w:rPr>
       </w:pPr>
-      <w:bookmarkStart w:id="46" w:name="_Toc241234534"/>
-      <w:bookmarkStart w:id="47" w:name="_Toc2973"/>
+      <w:bookmarkStart w:id="46" w:name="_Toc2973"/>
+      <w:bookmarkStart w:id="47" w:name="_Toc241234534"/>
       <w:r>
         <w:rPr>
           <w:rStyle w:val="20"/>
@@ -9630,8 +9637,8 @@
         <w:pStyle w:val="3"/>
         <w:ind w:left="142" w:hanging="426"/>
       </w:pPr>
-      <w:bookmarkStart w:id="48" w:name="_Toc241234535"/>
-      <w:bookmarkStart w:id="49" w:name="_Toc23668"/>
+      <w:bookmarkStart w:id="48" w:name="_Toc23668"/>
+      <w:bookmarkStart w:id="49" w:name="_Toc241234535"/>
       <w:r>
         <w:rPr>
           <w:rStyle w:val="20"/>
@@ -9878,8 +9885,8 @@
         <w:ind w:left="0" w:hanging="426"/>
         <w:jc w:val="both"/>
       </w:pPr>
-      <w:bookmarkStart w:id="50" w:name="_Toc241234536"/>
-      <w:bookmarkStart w:id="51" w:name="_Toc6504"/>
+      <w:bookmarkStart w:id="50" w:name="_Toc6504"/>
+      <w:bookmarkStart w:id="51" w:name="_Toc241234536"/>
       <w:r>
         <w:rPr>
           <w:rStyle w:val="20"/>
@@ -9923,8 +9930,8 @@
           <w:rFonts w:cs="Times New Roman"/>
         </w:rPr>
       </w:pPr>
-      <w:bookmarkStart w:id="52" w:name="_Toc241234537"/>
-      <w:bookmarkStart w:id="53" w:name="_Toc2002"/>
+      <w:bookmarkStart w:id="52" w:name="_Toc2002"/>
+      <w:bookmarkStart w:id="53" w:name="_Toc241234537"/>
       <w:r>
         <w:rPr>
           <w:rStyle w:val="20"/>
@@ -10027,8 +10034,8 @@
           <w:sz w:val="32"/>
         </w:rPr>
       </w:pPr>
-      <w:bookmarkStart w:id="54" w:name="_Toc241234539"/>
-      <w:bookmarkStart w:id="55" w:name="_Toc29108"/>
+      <w:bookmarkStart w:id="54" w:name="_Toc29108"/>
+      <w:bookmarkStart w:id="55" w:name="_Toc241234539"/>
       <w:r>
         <w:rPr>
           <w:rStyle w:val="20"/>
@@ -10715,6 +10722,16 @@
 </file>
 
 <file path=word/footer1.xml><?xml version="1.0" encoding="utf-8"?>
+<w:ftr xmlns:wpc="http://schemas.microsoft.com/office/word/2010/wordprocessingCanvas" xmlns:mc="http://schemas.openxmlformats.org/markup-compatibility/2006" xmlns:o="urn:schemas-microsoft-com:office:office" xmlns:r="http://schemas.openxmlformats.org/officeDocument/2006/relationships" xmlns:m="http://schemas.openxmlformats.org/officeDocument/2006/math" xmlns:v="urn:schemas-microsoft-com:vml" xmlns:wp14="http://schemas.microsoft.com/office/word/2010/wordprocessingDrawing" xmlns:wp="http://schemas.openxmlformats.org/drawingml/2006/wordprocessingDrawing" xmlns:w10="urn:schemas-microsoft-com:office:word" xmlns:w="http://schemas.openxmlformats.org/wordprocessingml/2006/main" xmlns:w14="http://schemas.microsoft.com/office/word/2010/wordml" xmlns:w15="http://schemas.microsoft.com/office/word/2012/wordml" xmlns:wpg="http://schemas.microsoft.com/office/word/2010/wordprocessingGroup" xmlns:wpi="http://schemas.microsoft.com/office/word/2010/wordprocessingInk" xmlns:wne="http://schemas.microsoft.com/office/word/2006/wordml" xmlns:wps="http://schemas.microsoft.com/office/word/2010/wordprocessingShape" xmlns:wpsCustomData="http://www.wps.cn/officeDocument/2013/wpsCustomData" mc:Ignorable="w14 w15 wp14">
+  <w:p>
+    <w:pPr>
+      <w:pStyle w:val="8"/>
+    </w:pPr>
+  </w:p>
+</w:ftr>
+</file>
+
+<file path=word/footer2.xml><?xml version="1.0" encoding="utf-8"?>
 <w:ftr xmlns:wpc="http://schemas.microsoft.com/office/word/2010/wordprocessingCanvas" xmlns:mc="http://schemas.openxmlformats.org/markup-compatibility/2006" xmlns:o="urn:schemas-microsoft-com:office:office" xmlns:r="http://schemas.openxmlformats.org/officeDocument/2006/relationships" xmlns:m="http://schemas.openxmlformats.org/officeDocument/2006/math" xmlns:v="urn:schemas-microsoft-com:vml" xmlns:wp14="http://schemas.microsoft.com/office/word/2010/wordprocessingDrawing" xmlns:wp="http://schemas.openxmlformats.org/drawingml/2006/wordprocessingDrawing" xmlns:w10="urn:schemas-microsoft-com:office:word" xmlns:w="http://schemas.openxmlformats.org/wordprocessingml/2006/main" xmlns:w14="http://schemas.microsoft.com/office/word/2010/wordml" xmlns:w15="http://schemas.microsoft.com/office/word/2012/wordml" xmlns:wpg="http://schemas.microsoft.com/office/word/2010/wordprocessingGroup" xmlns:wpi="http://schemas.microsoft.com/office/word/2010/wordprocessingInk" xmlns:wne="http://schemas.microsoft.com/office/word/2006/wordml" xmlns:wps="http://schemas.microsoft.com/office/word/2010/wordprocessingShape" xmlns:wpsCustomData="http://www.wps.cn/officeDocument/2013/wpsCustomData" mc:Ignorable="w14 w15 wp14">
   <w:sdt>
     <w:sdtPr>
@@ -10859,7 +10876,7 @@
 </w:ftr>
 </file>
 
-<file path=word/footer2.xml><?xml version="1.0" encoding="utf-8"?>
+<file path=word/footer3.xml><?xml version="1.0" encoding="utf-8"?>
 <w:ftr xmlns:wpc="http://schemas.microsoft.com/office/word/2010/wordprocessingCanvas" xmlns:mc="http://schemas.openxmlformats.org/markup-compatibility/2006" xmlns:o="urn:schemas-microsoft-com:office:office" xmlns:r="http://schemas.openxmlformats.org/officeDocument/2006/relationships" xmlns:m="http://schemas.openxmlformats.org/officeDocument/2006/math" xmlns:v="urn:schemas-microsoft-com:vml" xmlns:wp14="http://schemas.microsoft.com/office/word/2010/wordprocessingDrawing" xmlns:wp="http://schemas.openxmlformats.org/drawingml/2006/wordprocessingDrawing" xmlns:w10="urn:schemas-microsoft-com:office:word" xmlns:w="http://schemas.openxmlformats.org/wordprocessingml/2006/main" xmlns:w14="http://schemas.microsoft.com/office/word/2010/wordml" xmlns:w15="http://schemas.microsoft.com/office/word/2012/wordml" xmlns:wpg="http://schemas.microsoft.com/office/word/2010/wordprocessingGroup" xmlns:wpi="http://schemas.microsoft.com/office/word/2010/wordprocessingInk" xmlns:wne="http://schemas.microsoft.com/office/word/2006/wordml" xmlns:wps="http://schemas.microsoft.com/office/word/2010/wordprocessingShape" xmlns:wpsCustomData="http://www.wps.cn/officeDocument/2013/wpsCustomData" mc:Ignorable="w14 w15 wp14">
   <w:p>
     <w:pPr>
@@ -10869,7 +10886,17 @@
 </w:ftr>
 </file>
 
-<file path=word/footer3.xml><?xml version="1.0" encoding="utf-8"?>
+<file path=word/footer4.xml><?xml version="1.0" encoding="utf-8"?>
+<w:ftr xmlns:wpc="http://schemas.microsoft.com/office/word/2010/wordprocessingCanvas" xmlns:mc="http://schemas.openxmlformats.org/markup-compatibility/2006" xmlns:o="urn:schemas-microsoft-com:office:office" xmlns:r="http://schemas.openxmlformats.org/officeDocument/2006/relationships" xmlns:m="http://schemas.openxmlformats.org/officeDocument/2006/math" xmlns:v="urn:schemas-microsoft-com:vml" xmlns:wp14="http://schemas.microsoft.com/office/word/2010/wordprocessingDrawing" xmlns:wp="http://schemas.openxmlformats.org/drawingml/2006/wordprocessingDrawing" xmlns:w10="urn:schemas-microsoft-com:office:word" xmlns:w="http://schemas.openxmlformats.org/wordprocessingml/2006/main" xmlns:w14="http://schemas.microsoft.com/office/word/2010/wordml" xmlns:w15="http://schemas.microsoft.com/office/word/2012/wordml" xmlns:wpg="http://schemas.microsoft.com/office/word/2010/wordprocessingGroup" xmlns:wpi="http://schemas.microsoft.com/office/word/2010/wordprocessingInk" xmlns:wne="http://schemas.microsoft.com/office/word/2006/wordml" xmlns:wps="http://schemas.microsoft.com/office/word/2010/wordprocessingShape" xmlns:wpsCustomData="http://www.wps.cn/officeDocument/2013/wpsCustomData" mc:Ignorable="w14 w15 wp14">
+  <w:p>
+    <w:pPr>
+      <w:pStyle w:val="8"/>
+    </w:pPr>
+  </w:p>
+</w:ftr>
+</file>
+
+<file path=word/footer5.xml><?xml version="1.0" encoding="utf-8"?>
 <w:ftr xmlns:wpc="http://schemas.microsoft.com/office/word/2010/wordprocessingCanvas" xmlns:mc="http://schemas.openxmlformats.org/markup-compatibility/2006" xmlns:o="urn:schemas-microsoft-com:office:office" xmlns:r="http://schemas.openxmlformats.org/officeDocument/2006/relationships" xmlns:m="http://schemas.openxmlformats.org/officeDocument/2006/math" xmlns:v="urn:schemas-microsoft-com:vml" xmlns:wp14="http://schemas.microsoft.com/office/word/2010/wordprocessingDrawing" xmlns:wp="http://schemas.openxmlformats.org/drawingml/2006/wordprocessingDrawing" xmlns:w10="urn:schemas-microsoft-com:office:word" xmlns:w="http://schemas.openxmlformats.org/wordprocessingml/2006/main" xmlns:w14="http://schemas.microsoft.com/office/word/2010/wordml" xmlns:w15="http://schemas.microsoft.com/office/word/2012/wordml" xmlns:wpg="http://schemas.microsoft.com/office/word/2010/wordprocessingGroup" xmlns:wpi="http://schemas.microsoft.com/office/word/2010/wordprocessingInk" xmlns:wne="http://schemas.microsoft.com/office/word/2006/wordml" xmlns:wps="http://schemas.microsoft.com/office/word/2010/wordprocessingShape" xmlns:wpsCustomData="http://www.wps.cn/officeDocument/2013/wpsCustomData" mc:Ignorable="w14 w15 wp14">
   <w:sdt>
     <w:sdtPr>
@@ -10944,6 +10971,7 @@
       <w:spacing w:after="240"/>
       <w:jc w:val="center"/>
       <w:rPr>
+        <w:rFonts w:hint="default"/>
         <w:lang w:val="vi-VN"/>
       </w:rPr>
     </w:pPr>
@@ -11014,7 +11042,14 @@
       </mc:AlternateContent>
     </w:r>
     <w:r>
-      <w:t>Bài tập lớn: Dự đoán doanh số từ chi phí quảng cáo</w:t>
+      <w:t xml:space="preserve">Bài tập lớn: Dự đoán </w:t>
+    </w:r>
+    <w:r>
+      <w:rPr>
+        <w:rFonts w:hint="default"/>
+        <w:lang w:val="vi-VN"/>
+      </w:rPr>
+      <w:t>khả năng trúng tuyển sau đại học</w:t>
     </w:r>
   </w:p>
 </w:hdr>
@@ -11039,6 +11074,7 @@
       <w:spacing w:after="240"/>
       <w:jc w:val="center"/>
       <w:rPr>
+        <w:rFonts w:hint="default"/>
         <w:lang w:val="vi-VN"/>
       </w:rPr>
     </w:pPr>
@@ -11109,8 +11145,17 @@
       </mc:AlternateContent>
     </w:r>
     <w:r>
-      <w:t>Bài tập lớn: Dự đoán doanh số từ chi phí quảng cáo</w:t>
+      <w:t xml:space="preserve">Bài tập lớn: Dự đoán </w:t>
     </w:r>
+    <w:r>
+      <w:rPr>
+        <w:rFonts w:hint="default"/>
+        <w:lang w:val="vi-VN"/>
+      </w:rPr>
+      <w:t>khả năng trúng tuyển sau đại học</w:t>
+    </w:r>
+    <w:bookmarkStart w:id="59" w:name="_GoBack"/>
+    <w:bookmarkEnd w:id="59"/>
   </w:p>
 </w:hdr>
 </file>
@@ -11348,11 +11393,11 @@
     <w:lsdException w:unhideWhenUsed="0" w:uiPriority="0" w:semiHidden="0" w:name="Document Map"/>
     <w:lsdException w:unhideWhenUsed="0" w:uiPriority="0" w:semiHidden="0" w:name="Plain Text"/>
     <w:lsdException w:unhideWhenUsed="0" w:uiPriority="0" w:semiHidden="0" w:name="E-mail Signature"/>
-    <w:lsdException w:unhideWhenUsed="0" w:uiPriority="0" w:semiHidden="0" w:name="Normal (Web)"/>
+    <w:lsdException w:qFormat="1" w:unhideWhenUsed="0" w:uiPriority="0" w:semiHidden="0" w:name="Normal (Web)"/>
     <w:lsdException w:unhideWhenUsed="0" w:uiPriority="0" w:semiHidden="0" w:name="HTML Acronym"/>
     <w:lsdException w:unhideWhenUsed="0" w:uiPriority="0" w:semiHidden="0" w:name="HTML Address"/>
     <w:lsdException w:unhideWhenUsed="0" w:uiPriority="0" w:semiHidden="0" w:name="HTML Cite"/>
-    <w:lsdException w:unhideWhenUsed="0" w:uiPriority="0" w:semiHidden="0" w:name="HTML Code"/>
+    <w:lsdException w:qFormat="1" w:unhideWhenUsed="0" w:uiPriority="0" w:semiHidden="0" w:name="HTML Code"/>
     <w:lsdException w:unhideWhenUsed="0" w:uiPriority="0" w:semiHidden="0" w:name="HTML Definition"/>
     <w:lsdException w:unhideWhenUsed="0" w:uiPriority="0" w:semiHidden="0" w:name="HTML Keyboard"/>
     <w:lsdException w:unhideWhenUsed="0" w:uiPriority="0" w:semiHidden="0" w:name="HTML Preformatted"/>
@@ -11673,6 +11718,7 @@
   <w:style w:type="character" w:styleId="10">
     <w:name w:val="HTML Code"/>
     <w:basedOn w:val="5"/>
+    <w:qFormat/>
     <w:uiPriority w:val="0"/>
     <w:rPr>
       <w:rFonts w:ascii="Courier New" w:hAnsi="Courier New" w:cs="Courier New"/>
@@ -11698,6 +11744,7 @@
   </w:style>
   <w:style w:type="paragraph" w:styleId="12">
     <w:name w:val="Normal (Web)"/>
+    <w:qFormat/>
     <w:uiPriority w:val="0"/>
     <w:pPr>
       <w:spacing w:before="0" w:beforeAutospacing="1" w:after="0" w:afterAutospacing="1"/>
@@ -11705,6 +11752,7 @@
       <w:jc w:val="left"/>
     </w:pPr>
     <w:rPr>
+      <w:rFonts w:ascii="Times New Roman" w:hAnsi="Times New Roman" w:eastAsia="SimSun" w:cs="Times New Roman"/>
       <w:kern w:val="0"/>
       <w:sz w:val="24"/>
       <w:szCs w:val="24"/>

</xml_diff>